<commit_message>
Agregando último link en el documento
</commit_message>
<xml_diff>
--- a/TP_parcial_1.docx
+++ b/TP_parcial_1.docx
@@ -4183,30 +4183,7 @@
           <w:sz w:val="24"/>
           <w:szCs w:val="24"/>
         </w:rPr>
-        <w:t>Actualizar(construcci</w:t>
-      </w:r>
-      <w:r>
-        <w:rPr>
-          <w:rStyle w:val="11"/>
-          <w:rFonts w:hint="default" w:ascii="Times New Roman" w:hAnsi="Times New Roman" w:cs="Times New Roman"/>
-          <w:b/>
-          <w:bCs/>
-          <w:sz w:val="24"/>
-          <w:szCs w:val="24"/>
-          <w:lang/>
-        </w:rPr>
-        <w:t>+o</w:t>
-      </w:r>
-      <w:r>
-        <w:rPr>
-          <w:rStyle w:val="11"/>
-          <w:rFonts w:hint="default" w:ascii="Times New Roman" w:hAnsi="Times New Roman" w:cs="Times New Roman"/>
-          <w:b/>
-          <w:bCs/>
-          <w:sz w:val="24"/>
-          <w:szCs w:val="24"/>
-        </w:rPr>
-        <w:t>n: lista)</w:t>
+        <w:t>Actualizar(construcci+on: lista)</w:t>
       </w:r>
     </w:p>
     <w:p>
@@ -4328,26 +4305,7 @@
           <w:sz w:val="24"/>
           <w:szCs w:val="24"/>
         </w:rPr>
-        <w:t>Ganancia(construcci</w:t>
-      </w:r>
-      <w:r>
-        <w:rPr>
-          <w:rStyle w:val="11"/>
-          <w:rFonts w:hint="default" w:ascii="Times New Roman" w:hAnsi="Times New Roman" w:cs="Times New Roman"/>
-          <w:sz w:val="24"/>
-          <w:szCs w:val="24"/>
-          <w:lang/>
-        </w:rPr>
-        <w:t>ó</w:t>
-      </w:r>
-      <w:r>
-        <w:rPr>
-          <w:rStyle w:val="11"/>
-          <w:rFonts w:hint="default" w:ascii="Times New Roman" w:hAnsi="Times New Roman" w:cs="Times New Roman"/>
-          <w:sz w:val="24"/>
-          <w:szCs w:val="24"/>
-        </w:rPr>
-        <w:t>n: lista)</w:t>
+        <w:t>Ganancia(construcción: lista)</w:t>
       </w:r>
     </w:p>
     <w:p>
@@ -4688,9 +4646,49 @@
           <w:bCs/>
           <w:sz w:val="32"/>
           <w:szCs w:val="32"/>
-          <w:lang/>
         </w:rPr>
         <w:fldChar w:fldCharType="begin"/>
+      </w:r>
+      <w:r>
+        <w:rPr>
+          <w:rFonts w:hint="default" w:ascii="Times New Roman" w:hAnsi="Times New Roman" w:cs="Times New Roman"/>
+          <w:b/>
+          <w:bCs/>
+          <w:sz w:val="32"/>
+          <w:szCs w:val="32"/>
+        </w:rPr>
+        <w:instrText xml:space="preserve"> HYPERLINK "https://github.com/EliasDFranco/TP_parcial_1" </w:instrText>
+      </w:r>
+      <w:r>
+        <w:rPr>
+          <w:rFonts w:hint="default" w:ascii="Times New Roman" w:hAnsi="Times New Roman" w:cs="Times New Roman"/>
+          <w:b/>
+          <w:bCs/>
+          <w:sz w:val="32"/>
+          <w:szCs w:val="32"/>
+        </w:rPr>
+        <w:fldChar w:fldCharType="separate"/>
+      </w:r>
+      <w:r>
+        <w:rPr>
+          <w:rStyle w:val="12"/>
+          <w:rFonts w:hint="default" w:ascii="Times New Roman" w:hAnsi="Times New Roman" w:cs="Times New Roman"/>
+          <w:b/>
+          <w:bCs/>
+          <w:sz w:val="32"/>
+          <w:szCs w:val="32"/>
+        </w:rPr>
+        <w:t>GitHub</w:t>
+      </w:r>
+      <w:r>
+        <w:rPr>
+          <w:rFonts w:hint="default" w:ascii="Times New Roman" w:hAnsi="Times New Roman" w:cs="Times New Roman"/>
+          <w:b/>
+          <w:bCs/>
+          <w:sz w:val="32"/>
+          <w:szCs w:val="32"/>
+        </w:rPr>
+        <w:fldChar w:fldCharType="end"/>
       </w:r>
       <w:r>
         <w:rPr>
@@ -4701,8 +4699,10 @@
           <w:szCs w:val="32"/>
           <w:lang/>
         </w:rPr>
-        <w:instrText xml:space="preserve"> HYPERLINK "https://github.com/EliasDFranco/TP_parcial_1" </w:instrText>
+        <w:t xml:space="preserve"> - </w:t>
       </w:r>
+      <w:bookmarkStart w:id="1" w:name="_GoBack"/>
+      <w:bookmarkEnd w:id="1"/>
       <w:r>
         <w:rPr>
           <w:rFonts w:hint="default" w:ascii="Times New Roman" w:hAnsi="Times New Roman" w:cs="Times New Roman"/>
@@ -4712,11 +4712,15 @@
           <w:szCs w:val="32"/>
           <w:lang/>
         </w:rPr>
-        <w:fldChar w:fldCharType="separate"/>
+        <w:t xml:space="preserve"> Archivo word + código</w:t>
       </w:r>
-      <w:r>
-        <w:rPr>
-          <w:rStyle w:val="12"/>
+    </w:p>
+    <w:p>
+      <w:pPr>
+        <w:spacing w:after="180" w:line="259" w:lineRule="auto"/>
+        <w:ind w:left="0" w:leftChars="0" w:firstLine="0" w:firstLineChars="0"/>
+        <w:jc w:val="both"/>
+        <w:rPr>
           <w:rFonts w:hint="default" w:ascii="Times New Roman" w:hAnsi="Times New Roman" w:cs="Times New Roman"/>
           <w:b/>
           <w:bCs/>
@@ -4724,7 +4728,57 @@
           <w:szCs w:val="32"/>
           <w:lang/>
         </w:rPr>
-        <w:t>GitHub</w:t>
+      </w:pPr>
+      <w:r>
+        <w:rPr>
+          <w:rFonts w:hint="default" w:ascii="Times New Roman" w:hAnsi="Times New Roman" w:cs="Times New Roman"/>
+          <w:b/>
+          <w:bCs/>
+          <w:sz w:val="32"/>
+          <w:szCs w:val="32"/>
+        </w:rPr>
+        <w:fldChar w:fldCharType="begin"/>
+      </w:r>
+      <w:r>
+        <w:rPr>
+          <w:rFonts w:hint="default" w:ascii="Times New Roman" w:hAnsi="Times New Roman" w:cs="Times New Roman"/>
+          <w:b/>
+          <w:bCs/>
+          <w:sz w:val="32"/>
+          <w:szCs w:val="32"/>
+        </w:rPr>
+        <w:instrText xml:space="preserve"> HYPERLINK "https://drive.google.com/file/d/1p0kibOWKC--9yWottCF8dguIhoAYsRUL/view?usp=drivesdk" </w:instrText>
+      </w:r>
+      <w:r>
+        <w:rPr>
+          <w:rFonts w:hint="default" w:ascii="Times New Roman" w:hAnsi="Times New Roman" w:cs="Times New Roman"/>
+          <w:b/>
+          <w:bCs/>
+          <w:sz w:val="32"/>
+          <w:szCs w:val="32"/>
+        </w:rPr>
+        <w:fldChar w:fldCharType="separate"/>
+      </w:r>
+      <w:r>
+        <w:rPr>
+          <w:rStyle w:val="12"/>
+          <w:rFonts w:hint="default" w:ascii="Times New Roman" w:hAnsi="Times New Roman" w:cs="Times New Roman"/>
+          <w:b/>
+          <w:bCs/>
+          <w:sz w:val="32"/>
+          <w:szCs w:val="32"/>
+        </w:rPr>
+        <w:t>Google Drive</w:t>
+      </w:r>
+      <w:r>
+        <w:rPr>
+          <w:rFonts w:hint="default" w:ascii="Times New Roman" w:hAnsi="Times New Roman" w:cs="Times New Roman"/>
+          <w:b/>
+          <w:bCs/>
+          <w:sz w:val="32"/>
+          <w:szCs w:val="32"/>
+        </w:rPr>
+        <w:fldChar w:fldCharType="end"/>
       </w:r>
       <w:r>
         <w:rPr>
@@ -4735,33 +4789,7 @@
           <w:szCs w:val="32"/>
           <w:lang/>
         </w:rPr>
-        <w:fldChar w:fldCharType="end"/>
-      </w:r>
-      <w:bookmarkStart w:id="1" w:name="_GoBack"/>
-      <w:bookmarkEnd w:id="1"/>
-    </w:p>
-    <w:p>
-      <w:pPr>
-        <w:spacing w:after="180" w:line="259" w:lineRule="auto"/>
-        <w:ind w:left="0" w:leftChars="0" w:firstLine="0" w:firstLineChars="0"/>
-        <w:jc w:val="both"/>
-        <w:rPr>
-          <w:rFonts w:hint="default" w:ascii="Times New Roman" w:hAnsi="Times New Roman" w:cs="Times New Roman"/>
-          <w:b/>
-          <w:bCs/>
-          <w:sz w:val="32"/>
-          <w:szCs w:val="32"/>
-        </w:rPr>
-      </w:pPr>
-      <w:r>
-        <w:rPr>
-          <w:rFonts w:hint="default" w:ascii="Times New Roman" w:hAnsi="Times New Roman" w:cs="Times New Roman"/>
-          <w:b/>
-          <w:bCs/>
-          <w:sz w:val="32"/>
-          <w:szCs w:val="32"/>
-        </w:rPr>
-        <w:t>Google Drive</w:t>
+        <w:t xml:space="preserve"> - Código</w:t>
       </w:r>
     </w:p>
     <w:p>

</xml_diff>